<commit_message>
Horizon #1207: add 1h credit for 22 Oct late start (Norbert 7064); grand 124,371.45
Co-Authored-By: Claude Opus 5.5 (1M context) <noreply@anthropic.com>
</commit_message>
<xml_diff>
--- a/payments/2026-10/# 1207 - Invoice Horizon Entertainment (October 26).docx
+++ b/payments/2026-10/# 1207 - Invoice Horizon Entertainment (October 26).docx
@@ -1627,6 +1627,377 @@
             <w:tcW w:w="590" w:type="dxa"/>
             <w:tcBorders>
               <w:top w:val="nil"/>
+              <w:left w:val="single" w:sz="8" w:space="0" w:color="auto"/>
+              <w:bottom w:val="single" w:sz="8" w:space="0" w:color="auto"/>
+              <w:right w:val="nil"/>
+            </w:tcBorders>
+            <w:noWrap/>
+            <w:vAlign w:val="center"/>
+            <w:hideMark/>
+          </w:tcPr>
+          <w:p>
+            <w:pPr>
+              <w:jc w:val="center"/>
+              <w:rPr>
+                <w:rFonts w:ascii="Arial" w:hAnsi="Arial" w:cs="Arial"/>
+                <w:color w:val="000000"/>
+                <w:sz w:val="16"/>
+                <w:szCs w:val="16"/>
+              </w:rPr>
+            </w:pPr>
+            <w:r>
+              <w:rPr>
+                <w:rFonts w:ascii="Arial" w:hAnsi="Arial" w:cs="Arial"/>
+                <w:color w:val="000000"/>
+                <w:sz w:val="16"/>
+                <w:szCs w:val="16"/>
+              </w:rPr>
+              <w:t>2</w:t>
+            </w:r>
+          </w:p>
+        </w:tc>
+        <w:tc>
+          <w:tcPr>
+            <w:tcW w:w="1675" w:type="dxa"/>
+            <w:tcBorders>
+              <w:top w:val="nil"/>
+              <w:left w:val="single" w:sz="8" w:space="0" w:color="auto"/>
+              <w:bottom w:val="single" w:sz="8" w:space="0" w:color="auto"/>
+              <w:right w:val="single" w:sz="8" w:space="0" w:color="auto"/>
+            </w:tcBorders>
+            <w:noWrap/>
+            <w:vAlign w:val="center"/>
+            <w:hideMark/>
+          </w:tcPr>
+          <w:p>
+            <w:pPr>
+              <w:jc w:val="center"/>
+              <w:rPr>
+                <w:rFonts w:ascii="Arial" w:hAnsi="Arial" w:cs="Arial"/>
+                <w:color w:val="000000"/>
+                <w:sz w:val="16"/>
+                <w:szCs w:val="16"/>
+              </w:rPr>
+            </w:pPr>
+            <w:r>
+              <w:rPr>
+                <w:rFonts w:ascii="Arial" w:hAnsi="Arial" w:cs="Arial"/>
+                <w:color w:val="000000"/>
+                <w:sz w:val="16"/>
+                <w:szCs w:val="16"/>
+              </w:rPr>
+              <w:t>Credit - DJ late start (1 hour)</w:t>
+            </w:r>
+            <w:r>
+              <w:rPr>
+                <w:rFonts w:ascii="Arial" w:hAnsi="Arial" w:cs="Arial"/>
+                <w:color w:val="000000"/>
+                <w:sz w:val="16"/>
+                <w:szCs w:val="16"/>
+              </w:rPr>
+            </w:r>
+          </w:p>
+        </w:tc>
+        <w:tc>
+          <w:tcPr>
+            <w:tcW w:w="2049" w:type="dxa"/>
+            <w:tcBorders>
+              <w:top w:val="nil"/>
+              <w:left w:val="nil"/>
+              <w:bottom w:val="single" w:sz="8" w:space="0" w:color="auto"/>
+              <w:right w:val="single" w:sz="8" w:space="0" w:color="auto"/>
+            </w:tcBorders>
+            <w:noWrap/>
+            <w:vAlign w:val="center"/>
+            <w:hideMark/>
+          </w:tcPr>
+          <w:p>
+            <w:pPr>
+              <w:jc w:val="center"/>
+              <w:rPr>
+                <w:rFonts w:ascii="Arial" w:hAnsi="Arial" w:cs="Arial"/>
+                <w:color w:val="000000"/>
+                <w:sz w:val="16"/>
+                <w:szCs w:val="16"/>
+              </w:rPr>
+            </w:pPr>
+            <w:r>
+              <w:rPr>
+                <w:rFonts w:ascii="Arial" w:hAnsi="Arial" w:cs="Arial"/>
+                <w:color w:val="000000"/>
+                <w:sz w:val="16"/>
+                <w:szCs w:val="16"/>
+              </w:rPr>
+              <w:t>22.10.2026</w:t>
+            </w:r>
+            <w:r>
+              <w:rPr>
+                <w:rFonts w:ascii="Arial" w:hAnsi="Arial" w:cs="Arial"/>
+                <w:color w:val="000000"/>
+                <w:sz w:val="16"/>
+                <w:szCs w:val="16"/>
+              </w:rPr>
+            </w:r>
+            <w:r>
+              <w:rPr>
+                <w:rFonts w:ascii="Arial" w:hAnsi="Arial" w:cs="Arial"/>
+                <w:color w:val="000000"/>
+                <w:sz w:val="16"/>
+                <w:szCs w:val="16"/>
+              </w:rPr>
+            </w:r>
+            <w:r>
+              <w:rPr>
+                <w:rFonts w:ascii="Arial" w:hAnsi="Arial" w:cs="Arial"/>
+                <w:color w:val="000000"/>
+                <w:sz w:val="16"/>
+                <w:szCs w:val="16"/>
+              </w:rPr>
+            </w:r>
+            <w:r>
+              <w:rPr>
+                <w:rFonts w:ascii="Arial" w:hAnsi="Arial" w:cs="Arial"/>
+                <w:color w:val="000000"/>
+                <w:sz w:val="16"/>
+                <w:szCs w:val="16"/>
+              </w:rPr>
+            </w:r>
+            <w:r>
+              <w:rPr>
+                <w:rFonts w:ascii="Arial" w:hAnsi="Arial" w:cs="Arial"/>
+                <w:color w:val="000000"/>
+                <w:sz w:val="16"/>
+                <w:szCs w:val="16"/>
+              </w:rPr>
+            </w:r>
+            <w:r>
+              <w:rPr>
+                <w:rFonts w:ascii="Arial" w:hAnsi="Arial" w:cs="Arial"/>
+                <w:color w:val="000000"/>
+                <w:sz w:val="16"/>
+                <w:szCs w:val="16"/>
+              </w:rPr>
+            </w:r>
+            <w:r>
+              <w:rPr>
+                <w:rFonts w:ascii="Arial" w:hAnsi="Arial" w:cs="Arial"/>
+                <w:color w:val="000000"/>
+                <w:sz w:val="16"/>
+                <w:szCs w:val="16"/>
+              </w:rPr>
+            </w:r>
+            <w:r>
+              <w:rPr>
+                <w:rFonts w:ascii="Arial" w:hAnsi="Arial" w:cs="Arial"/>
+                <w:color w:val="000000"/>
+                <w:sz w:val="16"/>
+                <w:szCs w:val="16"/>
+              </w:rPr>
+            </w:r>
+            <w:r>
+              <w:rPr>
+                <w:rFonts w:ascii="Arial" w:hAnsi="Arial" w:cs="Arial"/>
+                <w:color w:val="000000"/>
+                <w:sz w:val="16"/>
+                <w:szCs w:val="16"/>
+              </w:rPr>
+            </w:r>
+            <w:r>
+              <w:rPr>
+                <w:rFonts w:ascii="Arial" w:hAnsi="Arial" w:cs="Arial"/>
+                <w:color w:val="000000"/>
+                <w:sz w:val="16"/>
+                <w:szCs w:val="16"/>
+              </w:rPr>
+            </w:r>
+            <w:r>
+              <w:rPr>
+                <w:rFonts w:ascii="Arial" w:hAnsi="Arial" w:cs="Arial"/>
+                <w:color w:val="000000"/>
+                <w:sz w:val="16"/>
+                <w:szCs w:val="16"/>
+              </w:rPr>
+            </w:r>
+          </w:p>
+        </w:tc>
+        <w:tc>
+          <w:tcPr>
+            <w:tcW w:w="1248" w:type="dxa"/>
+            <w:tcBorders>
+              <w:top w:val="nil"/>
+              <w:left w:val="nil"/>
+              <w:bottom w:val="single" w:sz="8" w:space="0" w:color="auto"/>
+              <w:right w:val="nil"/>
+            </w:tcBorders>
+            <w:noWrap/>
+            <w:vAlign w:val="center"/>
+            <w:hideMark/>
+          </w:tcPr>
+          <w:p>
+            <w:pPr>
+              <w:jc w:val="center"/>
+              <w:rPr>
+                <w:rFonts w:ascii="Arial" w:hAnsi="Arial" w:cs="Arial"/>
+                <w:color w:val="000000"/>
+                <w:sz w:val="16"/>
+                <w:szCs w:val="16"/>
+              </w:rPr>
+            </w:pPr>
+            <w:r>
+              <w:rPr>
+                <w:rFonts w:ascii="Arial" w:hAnsi="Arial" w:cs="Arial"/>
+                <w:color w:val="000000"/>
+                <w:sz w:val="16"/>
+                <w:szCs w:val="16"/>
+                <w:lang w:bidi="ar-SA"/>
+              </w:rPr>
+              <w:t>-</w:t>
+            </w:r>
+          </w:p>
+        </w:tc>
+        <w:tc>
+          <w:tcPr>
+            <w:tcW w:w="1562" w:type="dxa"/>
+            <w:tcBorders>
+              <w:top w:val="nil"/>
+              <w:left w:val="single" w:sz="8" w:space="0" w:color="auto"/>
+              <w:bottom w:val="single" w:sz="8" w:space="0" w:color="auto"/>
+              <w:right w:val="single" w:sz="8" w:space="0" w:color="auto"/>
+            </w:tcBorders>
+            <w:noWrap/>
+            <w:vAlign w:val="center"/>
+            <w:hideMark/>
+          </w:tcPr>
+          <w:p>
+            <w:pPr>
+              <w:jc w:val="center"/>
+              <w:rPr>
+                <w:rFonts w:ascii="Arial" w:hAnsi="Arial" w:cs="Arial"/>
+                <w:color w:val="000000"/>
+                <w:sz w:val="16"/>
+                <w:szCs w:val="16"/>
+              </w:rPr>
+            </w:pPr>
+            <w:r>
+              <w:rPr>
+                <w:rFonts w:ascii="Arial" w:hAnsi="Arial" w:cs="Arial"/>
+                <w:color w:val="000000"/>
+                <w:sz w:val="16"/>
+                <w:szCs w:val="16"/>
+              </w:rPr>
+              <w:t>-945.00 THB</w:t>
+            </w:r>
+            <w:r>
+              <w:rPr>
+                <w:rFonts w:ascii="Arial" w:hAnsi="Arial" w:cs="Arial"/>
+                <w:color w:val="000000"/>
+                <w:sz w:val="16"/>
+                <w:szCs w:val="16"/>
+              </w:rPr>
+            </w:r>
+            <w:r>
+              <w:rPr>
+                <w:rFonts w:ascii="Arial" w:hAnsi="Arial" w:cs="Arial"/>
+                <w:color w:val="000000"/>
+                <w:sz w:val="16"/>
+                <w:szCs w:val="16"/>
+              </w:rPr>
+            </w:r>
+            <w:r>
+              <w:rPr>
+                <w:rFonts w:ascii="Arial" w:hAnsi="Arial" w:cs="Arial"/>
+                <w:color w:val="000000"/>
+                <w:sz w:val="16"/>
+                <w:szCs w:val="16"/>
+              </w:rPr>
+            </w:r>
+            <w:r>
+              <w:rPr>
+                <w:rFonts w:ascii="Arial" w:hAnsi="Arial" w:cs="Arial"/>
+                <w:color w:val="000000"/>
+                <w:sz w:val="16"/>
+                <w:szCs w:val="16"/>
+              </w:rPr>
+            </w:r>
+            <w:r>
+              <w:rPr>
+                <w:rFonts w:ascii="Arial" w:hAnsi="Arial" w:cs="Arial"/>
+                <w:color w:val="000000"/>
+                <w:sz w:val="16"/>
+                <w:szCs w:val="16"/>
+              </w:rPr>
+            </w:r>
+          </w:p>
+        </w:tc>
+        <w:tc>
+          <w:tcPr>
+            <w:tcW w:w="1673" w:type="dxa"/>
+            <w:tcBorders>
+              <w:top w:val="nil"/>
+              <w:left w:val="single" w:sz="8" w:space="0" w:color="auto"/>
+              <w:bottom w:val="single" w:sz="8" w:space="0" w:color="auto"/>
+              <w:right w:val="single" w:sz="8" w:space="0" w:color="auto"/>
+            </w:tcBorders>
+            <w:noWrap/>
+            <w:vAlign w:val="center"/>
+            <w:hideMark/>
+          </w:tcPr>
+          <w:p>
+            <w:pPr>
+              <w:jc w:val="right"/>
+              <w:rPr>
+                <w:rFonts w:ascii="Arial" w:hAnsi="Arial" w:cs="Arial"/>
+                <w:color w:val="000000"/>
+                <w:sz w:val="16"/>
+                <w:szCs w:val="16"/>
+              </w:rPr>
+            </w:pPr>
+            <w:r>
+              <w:rPr>
+                <w:rFonts w:ascii="Arial" w:hAnsi="Arial" w:cs="Arial"/>
+                <w:color w:val="000000"/>
+                <w:sz w:val="16"/>
+                <w:szCs w:val="16"/>
+              </w:rPr>
+              <w:t>-945.00 THB</w:t>
+            </w:r>
+            <w:r>
+              <w:rPr>
+                <w:rFonts w:ascii="Arial" w:hAnsi="Arial" w:cs="Arial"/>
+                <w:color w:val="000000"/>
+                <w:sz w:val="16"/>
+                <w:szCs w:val="16"/>
+              </w:rPr>
+            </w:r>
+            <w:r>
+              <w:rPr>
+                <w:rFonts w:ascii="Arial" w:hAnsi="Arial" w:cs="Arial"/>
+                <w:color w:val="000000"/>
+                <w:sz w:val="16"/>
+                <w:szCs w:val="16"/>
+              </w:rPr>
+            </w:r>
+            <w:r>
+              <w:rPr>
+                <w:rFonts w:ascii="Arial" w:hAnsi="Arial" w:cs="Arial"/>
+                <w:color w:val="000000"/>
+                <w:sz w:val="16"/>
+                <w:szCs w:val="16"/>
+              </w:rPr>
+            </w:r>
+          </w:p>
+        </w:tc>
+      </w:tr>
+      <w:tr>
+        <w:trPr>
+          <w:trHeight w:val="227"/>
+          <w:jc w:val="center"/>
+        </w:trPr>
+        <w:tc>
+          <w:tcPr>
+            <w:tcW w:w="590" w:type="dxa"/>
+            <w:tcBorders>
+              <w:top w:val="nil"/>
               <w:left w:val="nil"/>
               <w:bottom w:val="nil"/>
               <w:right w:val="nil"/>
@@ -1790,7 +2161,7 @@
                 <w:sz w:val="16"/>
                 <w:szCs w:val="16"/>
               </w:rPr>
-              <w:t>117,180.00 THB</w:t>
+              <w:t>116,235.00 THB</w:t>
             </w:r>
             <w:r>
               <w:rPr>
@@ -1991,7 +2362,7 @@
                 <w:sz w:val="16"/>
                 <w:szCs w:val="16"/>
               </w:rPr>
-              <w:t>8,202.60 THB</w:t>
+              <w:t>8,136.45 THB</w:t>
             </w:r>
             <w:r>
               <w:rPr>
@@ -2194,7 +2565,7 @@
                 <w:sz w:val="16"/>
                 <w:szCs w:val="16"/>
               </w:rPr>
-              <w:t>125,382.60 THB</w:t>
+              <w:t>124,371.45 THB</w:t>
             </w:r>
             <w:r>
               <w:rPr>
@@ -2263,7 +2634,7 @@
                 <w:sz w:val="16"/>
                 <w:szCs w:val="16"/>
               </w:rPr>
-              <w:t>ONE HUNDRED TWENTY-FIVE THOUSAND THREE HUNDRED EIGHTY-TWO BAHT AND SIXTY SATANG</w:t>
+              <w:t>ONE HUNDRED TWENTY-FOUR THOUSAND THREE HUNDRED SEVENTY-ONE BAHT AND FORTY-FIVE SATANG</w:t>
             </w:r>
           </w:p>
         </w:tc>

</xml_diff>